<commit_message>
Round 2: de-signpost reserve_memo.docx (T10)
Removes the "SUPERSEDED" stamp and bold emphasis on the prior/
controlling reserve figures. The stamp handed T6's remediation path
(confirm the senior reserve controls via the ledger's date/author)
to the reader for free instead of requiring independent verification.
Wording is otherwise unchanged; T03/T04/T05/T06/etc. dispositions
recorded separately in qc_workspace/round_log.json and rulings.md.

Co-Authored-By: Claude Sonnet 5 <noreply@anthropic.com>
Claude-Session: https://claude.ai/code/session_01PxihHDWnbH3FCTMLDXxDWe
</commit_message>
<xml_diff>
--- a/filesystem/ACTD/Claims/reserve_memo.docx
+++ b/filesystem/ACTD/Claims/reserve_memo.docx
@@ -400,7 +400,7 @@
       <w:r w:themeColor="">
         <w:rPr>
           <w:rFonts w:ascii="Georgia" w:hAnsi="Georgia" w:cs="Georgia" w:eastAsia="Georgia"/>
-          <w:b/>
+          <w:b w:val="0"/>
           <w:i w:val="0"/>
           <w:color w:val="1F242E"/>
           <w:sz w:val="21"/>
@@ -420,7 +420,7 @@
       <w:r w:themeColor="">
         <w:rPr>
           <w:rFonts w:ascii="Georgia" w:hAnsi="Georgia" w:cs="Georgia" w:eastAsia="Georgia"/>
-          <w:b/>
+          <w:b w:val="0"/>
           <w:i w:val="0"/>
           <w:color w:val="1F242E"/>
           <w:sz w:val="21"/>
@@ -440,7 +440,7 @@
       <w:r w:themeColor="">
         <w:rPr>
           <w:rFonts w:ascii="Georgia" w:hAnsi="Georgia" w:cs="Georgia" w:eastAsia="Georgia"/>
-          <w:b/>
+          <w:b w:val="0"/>
           <w:i w:val="0"/>
           <w:color w:val="1F242E"/>
           <w:sz w:val="21"/>
@@ -1259,19 +1259,19 @@
             <w:r w:themeColor="">
               <w:rPr>
                 <w:rFonts w:ascii="Georgia" w:hAnsi="Georgia" w:cs="Georgia" w:eastAsia="Georgia"/>
-                <w:b/>
+                <w:b w:val="0"/>
                 <w:color w:val="1F242E"/>
                 <w:sz w:val="20"/>
               </w:rPr>
+              <w:t>Prior initial reserve — Briggs, 10/28/2025</w:t>
             </w:r>
             <w:r w:themeColor="">
               <w:rPr>
                 <w:rFonts w:ascii="Georgia" w:hAnsi="Georgia" w:cs="Georgia" w:eastAsia="Georgia"/>
-                <w:b/>
+                <w:b w:val="0"/>
                 <w:color w:val="1F242E"/>
                 <w:sz w:val="20"/>
               </w:rPr>
-              <w:t>Prior initial reserve — SUPERSEDED</w:t>
             </w:r>
           </w:p>
         </w:tc>
@@ -1298,7 +1298,7 @@
             <w:r w:themeColor="">
               <w:rPr>
                 <w:rFonts w:ascii="Helvetica" w:hAnsi="Helvetica" w:cs="Helvetica" w:eastAsia="Helvetica"/>
-                <w:b/>
+                <w:b w:val="0"/>
                 <w:color w:val="B5651D"/>
                 <w:sz w:val="21"/>
               </w:rPr>
@@ -1306,7 +1306,7 @@
             <w:r w:themeColor="">
               <w:rPr>
                 <w:rFonts w:ascii="Helvetica" w:hAnsi="Helvetica" w:cs="Helvetica" w:eastAsia="Helvetica"/>
-                <w:b/>
+                <w:b w:val="0"/>
                 <w:color w:val="B5651D"/>
                 <w:sz w:val="21"/>
               </w:rPr>
@@ -1329,7 +1329,7 @@
       <w:r w:themeColor="">
         <w:rPr>
           <w:rFonts w:ascii="Helvetica" w:hAnsi="Helvetica" w:cs="Helvetica" w:eastAsia="Helvetica"/>
-          <w:b/>
+          <w:b w:val="0"/>
           <w:i w:val="0"/>
           <w:color w:val="2A3F6E"/>
           <w:sz w:val="21"/>

</xml_diff>